<commit_message>
adding new resume image and adding changes to coverletter and user profile
</commit_message>
<xml_diff>
--- a/skills/job-application-helper/assets/Ted_Cohen-COVERLETTER.docx
+++ b/skills/job-application-helper/assets/Ted_Cohen-COVERLETTER.docx
@@ -171,25 +171,43 @@
     </w:p>
     <w:p/>
     <w:p>
-      <w:r>
+      <w:pPr>
+        <w:rPr>
+          <w:rFonts w:ascii="Arial" w:hAnsi="Arial" w:cs="Arial"/>
+          <w:sz w:val="20"/>
+          <w:szCs w:val="20"/>
+        </w:rPr>
+      </w:pPr>
+      <w:r>
+        <w:rPr>
+          <w:rFonts w:ascii="Arial" w:hAnsi="Arial" w:cs="Arial"/>
+          <w:sz w:val="20"/>
+          <w:szCs w:val="20"/>
+        </w:rPr>
         <w:t>All the best,</w:t>
       </w:r>
     </w:p>
     <w:p>
-      <w:r>
+      <w:pPr>
+        <w:rPr>
+          <w:rFonts w:ascii="Arial" w:hAnsi="Arial" w:cs="Arial"/>
+          <w:sz w:val="20"/>
+          <w:szCs w:val="20"/>
+        </w:rPr>
+      </w:pPr>
+      <w:r>
+        <w:rPr>
+          <w:rFonts w:ascii="Arial" w:hAnsi="Arial" w:cs="Arial"/>
+          <w:sz w:val="20"/>
+          <w:szCs w:val="20"/>
+        </w:rPr>
         <w:t>Ted</w:t>
       </w:r>
     </w:p>
     <w:p/>
     <w:p>
       <w:r>
-        <w:t>Research S</w:t>
-      </w:r>
-      <w:r>
-        <w:t>cientist</w:t>
-      </w:r>
-      <w:r>
-        <w:t>: Meta Reality Labs</w:t>
+        <w:t>Research Scientist &amp; Optical Engineer</w:t>
       </w:r>
     </w:p>
     <w:p>
@@ -264,6 +282,7 @@
         <w:docPartUnique/>
       </w:docPartObj>
     </w:sdtPr>
+    <w:sdtEndPr/>
     <w:sdtContent>
       <w:sdt>
         <w:sdtPr>
@@ -277,6 +296,7 @@
             <w:docPartUnique/>
           </w:docPartObj>
         </w:sdtPr>
+        <w:sdtEndPr/>
         <w:sdtContent>
           <w:p>
             <w:pPr>

</xml_diff>